<commit_message>
OCR for report analyzer
</commit_message>
<xml_diff>
--- a/Docs/Teleopthalmology Review.docx
+++ b/Docs/Teleopthalmology Review.docx
@@ -6,6 +6,7 @@
       <w:pPr>
         <w:pStyle w:val="Heading1"/>
         <w:spacing w:before="400" w:after="160"/>
+        <w:ind w:firstLine="720"/>
         <w:jc w:val="center"/>
         <w:rPr>
           <w:b/>
@@ -3871,25 +3872,7 @@
             <w:sz w:val="24"/>
             <w:szCs w:val="24"/>
           </w:rPr>
-          <w:t>https://www.hongdee</w:t>
-        </w:r>
-        <w:r>
-          <w:rPr>
-            <w:rStyle w:val="Hyperlink"/>
-            <w:rFonts w:asciiTheme="minorHAnsi" w:hAnsiTheme="minorHAnsi"/>
-            <w:sz w:val="24"/>
-            <w:szCs w:val="24"/>
-          </w:rPr>
-          <w:t>c</w:t>
-        </w:r>
-        <w:r>
-          <w:rPr>
-            <w:rStyle w:val="Hyperlink"/>
-            <w:rFonts w:asciiTheme="minorHAnsi" w:hAnsiTheme="minorHAnsi"/>
-            <w:sz w:val="24"/>
-            <w:szCs w:val="24"/>
-          </w:rPr>
-          <w:t>orp.com/</w:t>
+          <w:t>https://www.hongdeecorp.com/</w:t>
         </w:r>
       </w:hyperlink>
     </w:p>

</xml_diff>